<commit_message>
docs(legal): ajouter les dossiers documentaires et scripts associés
Versionne les documents juridiques/financement, la notice d'utilisation et les scripts de génération/import correspondants.

Co-authored-by: Cursor <cursoragent@cursor.com>
</commit_message>
<xml_diff>
--- a/docs/business-plan-aimediart.docx
+++ b/docs/business-plan-aimediart.docx
@@ -391,7 +391,7 @@
           <w:lang w:val="fr-FR"/>
         </w:rPr>
         <w:pict w14:anchorId="07B670A8">
-          <v:rect id="_x0000_i1026" style="width:0;height:1.5pt" o:hralign="center" o:hrstd="t" o:hr="t"/>
+          <v:rect id="_x0000_i1028" style="width:0;height:1.5pt" o:hralign="center" o:hrstd="t" o:hr="t"/>
         </w:pict>
       </w:r>
     </w:p>
@@ -4985,7 +4985,7 @@
           <w:lang w:val="fr-FR"/>
         </w:rPr>
         <w:pict w14:anchorId="4787CEAD">
-          <v:rect id="_x0000_i1660" style="width:0;height:1.5pt" o:hralign="center" o:hrstd="t" o:hr="t"/>
+          <v:rect id="_x0000_i1192" style="width:0;height:1.5pt" o:hralign="center" o:hrstd="t" o:hr="t"/>
         </w:pict>
       </w:r>
     </w:p>
@@ -4996,8 +4996,8 @@
           <w:lang w:val="fr-FR"/>
         </w:rPr>
       </w:pPr>
-      <w:bookmarkStart w:id="4" w:name="problème-et-solution"/>
-      <w:bookmarkStart w:id="5" w:name="_Toc235547827"/>
+      <w:bookmarkStart w:id="4" w:name="_Toc235547827"/>
+      <w:bookmarkStart w:id="5" w:name="problème-et-solution"/>
       <w:bookmarkEnd w:id="2"/>
       <w:r>
         <w:rPr>
@@ -5005,7 +5005,7 @@
         </w:rPr>
         <w:t>2. Problème et solution</w:t>
       </w:r>
-      <w:bookmarkEnd w:id="5"/>
+      <w:bookmarkEnd w:id="4"/>
     </w:p>
     <w:p>
       <w:pPr>
@@ -5014,15 +5014,15 @@
           <w:lang w:val="fr-FR"/>
         </w:rPr>
       </w:pPr>
-      <w:bookmarkStart w:id="6" w:name="problème"/>
-      <w:bookmarkStart w:id="7" w:name="_Toc235547828"/>
+      <w:bookmarkStart w:id="6" w:name="_Toc235547828"/>
+      <w:bookmarkStart w:id="7" w:name="problème"/>
       <w:r>
         <w:rPr>
           <w:lang w:val="fr-FR"/>
         </w:rPr>
         <w:t>Problème</w:t>
       </w:r>
-      <w:bookmarkEnd w:id="7"/>
+      <w:bookmarkEnd w:id="6"/>
     </w:p>
     <w:p>
       <w:pPr>
@@ -5053,9 +5053,9 @@
           <w:lang w:val="fr-FR"/>
         </w:rPr>
       </w:pPr>
-      <w:bookmarkStart w:id="8" w:name="solution-aimediart"/>
-      <w:bookmarkStart w:id="9" w:name="_Toc235547829"/>
-      <w:bookmarkEnd w:id="6"/>
+      <w:bookmarkStart w:id="8" w:name="_Toc235547829"/>
+      <w:bookmarkStart w:id="9" w:name="solution-aimediart"/>
+      <w:bookmarkEnd w:id="7"/>
       <w:r>
         <w:rPr>
           <w:lang w:val="fr-FR"/>
@@ -5069,7 +5069,7 @@
         </w:rPr>
         <w:t>AIMEDIArt</w:t>
       </w:r>
-      <w:bookmarkEnd w:id="9"/>
+      <w:bookmarkEnd w:id="8"/>
     </w:p>
     <w:p>
       <w:pPr>
@@ -5257,7 +5257,7 @@
           <w:lang w:val="fr-FR"/>
         </w:rPr>
         <w:pict w14:anchorId="59B51F06">
-          <v:rect id="_x0000_i1661" style="width:0;height:1.5pt" o:hralign="center" o:hrstd="t" o:hr="t"/>
+          <v:rect id="_x0000_i1193" style="width:0;height:1.5pt" o:hralign="center" o:hrstd="t" o:hr="t"/>
         </w:pict>
       </w:r>
     </w:p>
@@ -5268,17 +5268,17 @@
           <w:lang w:val="fr-FR"/>
         </w:rPr>
       </w:pPr>
-      <w:bookmarkStart w:id="10" w:name="analyse-de-marché"/>
-      <w:bookmarkStart w:id="11" w:name="_Toc235547830"/>
-      <w:bookmarkEnd w:id="4"/>
-      <w:bookmarkEnd w:id="8"/>
+      <w:bookmarkStart w:id="10" w:name="_Toc235547830"/>
+      <w:bookmarkStart w:id="11" w:name="analyse-de-marché"/>
+      <w:bookmarkEnd w:id="5"/>
+      <w:bookmarkEnd w:id="9"/>
       <w:r>
         <w:rPr>
           <w:lang w:val="fr-FR"/>
         </w:rPr>
         <w:t>3. Analyse de marché</w:t>
       </w:r>
-      <w:bookmarkEnd w:id="11"/>
+      <w:bookmarkEnd w:id="10"/>
     </w:p>
     <w:p>
       <w:pPr>
@@ -5303,15 +5303,15 @@
           <w:lang w:val="fr-FR"/>
         </w:rPr>
       </w:pPr>
-      <w:bookmarkStart w:id="12" w:name="volume-dexpositions-en-france"/>
-      <w:bookmarkStart w:id="13" w:name="_Toc235547831"/>
+      <w:bookmarkStart w:id="12" w:name="_Toc235547831"/>
+      <w:bookmarkStart w:id="13" w:name="volume-dexpositions-en-france"/>
       <w:r>
         <w:rPr>
           <w:lang w:val="fr-FR"/>
         </w:rPr>
         <w:t>3.1 Volume d’expositions en France</w:t>
       </w:r>
-      <w:bookmarkEnd w:id="13"/>
+      <w:bookmarkEnd w:id="12"/>
     </w:p>
     <w:tbl>
       <w:tblPr>
@@ -5771,16 +5771,16 @@
           <w:lang w:val="fr-FR"/>
         </w:rPr>
       </w:pPr>
-      <w:bookmarkStart w:id="14" w:name="segmentation-par-taille-dexposition"/>
-      <w:bookmarkStart w:id="15" w:name="_Toc235547832"/>
-      <w:bookmarkEnd w:id="12"/>
+      <w:bookmarkStart w:id="14" w:name="_Toc235547832"/>
+      <w:bookmarkStart w:id="15" w:name="segmentation-par-taille-dexposition"/>
+      <w:bookmarkEnd w:id="13"/>
       <w:r>
         <w:rPr>
           <w:lang w:val="fr-FR"/>
         </w:rPr>
         <w:t>3.2 Segmentation par taille d’exposition</w:t>
       </w:r>
-      <w:bookmarkEnd w:id="15"/>
+      <w:bookmarkEnd w:id="14"/>
     </w:p>
     <w:tbl>
       <w:tblPr>
@@ -6270,9 +6270,9 @@
           <w:lang w:val="fr-FR"/>
         </w:rPr>
       </w:pPr>
-      <w:bookmarkStart w:id="16" w:name="saisonnalité"/>
-      <w:bookmarkStart w:id="17" w:name="_Toc235547833"/>
-      <w:bookmarkEnd w:id="14"/>
+      <w:bookmarkStart w:id="16" w:name="_Toc235547833"/>
+      <w:bookmarkStart w:id="17" w:name="saisonnalité"/>
+      <w:bookmarkEnd w:id="15"/>
       <w:r>
         <w:rPr>
           <w:lang w:val="fr-FR"/>
@@ -6280,7 +6280,7 @@
         <w:lastRenderedPageBreak/>
         <w:t>3.3 Saisonnalité</w:t>
       </w:r>
-      <w:bookmarkEnd w:id="17"/>
+      <w:bookmarkEnd w:id="16"/>
     </w:p>
     <w:p>
       <w:pPr>
@@ -6361,16 +6361,16 @@
           <w:lang w:val="fr-FR"/>
         </w:rPr>
       </w:pPr>
-      <w:bookmarkStart w:id="18" w:name="marché-total-adressable-et-capturable"/>
-      <w:bookmarkStart w:id="19" w:name="_Toc235547834"/>
-      <w:bookmarkEnd w:id="16"/>
+      <w:bookmarkStart w:id="18" w:name="_Toc235547834"/>
+      <w:bookmarkStart w:id="19" w:name="marché-total-adressable-et-capturable"/>
+      <w:bookmarkEnd w:id="17"/>
       <w:r>
         <w:rPr>
           <w:lang w:val="fr-FR"/>
         </w:rPr>
         <w:t>3.4 Marché total, adressable et capturable</w:t>
       </w:r>
-      <w:bookmarkEnd w:id="19"/>
+      <w:bookmarkEnd w:id="18"/>
     </w:p>
     <w:tbl>
       <w:tblPr>
@@ -6994,7 +6994,7 @@
           <w:lang w:val="fr-FR"/>
         </w:rPr>
         <w:pict w14:anchorId="74B6B911">
-          <v:rect id="_x0000_i1662" style="width:0;height:1.5pt" o:hralign="center" o:hrstd="t" o:hr="t"/>
+          <v:rect id="_x0000_i1194" style="width:0;height:1.5pt" o:hralign="center" o:hrstd="t" o:hr="t"/>
         </w:pict>
       </w:r>
     </w:p>
@@ -7005,10 +7005,10 @@
           <w:lang w:val="fr-FR"/>
         </w:rPr>
       </w:pPr>
-      <w:bookmarkStart w:id="20" w:name="canevas-du-modèle-économiquebmc"/>
-      <w:bookmarkStart w:id="21" w:name="_Toc235547835"/>
-      <w:bookmarkEnd w:id="10"/>
-      <w:bookmarkEnd w:id="18"/>
+      <w:bookmarkStart w:id="20" w:name="_Toc235547835"/>
+      <w:bookmarkStart w:id="21" w:name="canevas-du-modèle-économiquebmc"/>
+      <w:bookmarkEnd w:id="11"/>
+      <w:bookmarkEnd w:id="19"/>
       <w:r>
         <w:rPr>
           <w:lang w:val="fr-FR"/>
@@ -7022,7 +7022,7 @@
         </w:rPr>
         <w:footnoteReference w:id="23"/>
       </w:r>
-      <w:bookmarkEnd w:id="21"/>
+      <w:bookmarkEnd w:id="20"/>
     </w:p>
     <w:p>
       <w:pPr>
@@ -7031,15 +7031,15 @@
           <w:lang w:val="fr-FR"/>
         </w:rPr>
       </w:pPr>
-      <w:bookmarkStart w:id="22" w:name="segments-de-clientèle"/>
-      <w:bookmarkStart w:id="23" w:name="_Toc235547836"/>
+      <w:bookmarkStart w:id="22" w:name="_Toc235547836"/>
+      <w:bookmarkStart w:id="23" w:name="segments-de-clientèle"/>
       <w:r>
         <w:rPr>
           <w:lang w:val="fr-FR"/>
         </w:rPr>
         <w:t>Segments de clientèle</w:t>
       </w:r>
-      <w:bookmarkEnd w:id="23"/>
+      <w:bookmarkEnd w:id="22"/>
     </w:p>
     <w:tbl>
       <w:tblPr>
@@ -7443,16 +7443,16 @@
           <w:lang w:val="fr-FR"/>
         </w:rPr>
       </w:pPr>
-      <w:bookmarkStart w:id="24" w:name="propositions-de-valeur"/>
-      <w:bookmarkStart w:id="25" w:name="_Toc235547837"/>
-      <w:bookmarkEnd w:id="22"/>
+      <w:bookmarkStart w:id="24" w:name="_Toc235547837"/>
+      <w:bookmarkStart w:id="25" w:name="propositions-de-valeur"/>
+      <w:bookmarkEnd w:id="23"/>
       <w:r>
         <w:rPr>
           <w:lang w:val="fr-FR"/>
         </w:rPr>
         <w:t>Propositions de valeur</w:t>
       </w:r>
-      <w:bookmarkEnd w:id="25"/>
+      <w:bookmarkEnd w:id="24"/>
     </w:p>
     <w:p>
       <w:pPr>
@@ -7551,16 +7551,16 @@
           <w:lang w:val="fr-FR"/>
         </w:rPr>
       </w:pPr>
-      <w:bookmarkStart w:id="26" w:name="canaux"/>
-      <w:bookmarkStart w:id="27" w:name="_Toc235547838"/>
-      <w:bookmarkEnd w:id="24"/>
+      <w:bookmarkStart w:id="26" w:name="_Toc235547838"/>
+      <w:bookmarkStart w:id="27" w:name="canaux"/>
+      <w:bookmarkEnd w:id="25"/>
       <w:r>
         <w:rPr>
           <w:lang w:val="fr-FR"/>
         </w:rPr>
         <w:t>Canaux</w:t>
       </w:r>
-      <w:bookmarkEnd w:id="27"/>
+      <w:bookmarkEnd w:id="26"/>
     </w:p>
     <w:p>
       <w:pPr>
@@ -7733,16 +7733,16 @@
           <w:lang w:val="fr-FR"/>
         </w:rPr>
       </w:pPr>
-      <w:bookmarkStart w:id="28" w:name="sources-de-revenus"/>
-      <w:bookmarkStart w:id="29" w:name="_Toc235547839"/>
-      <w:bookmarkEnd w:id="26"/>
+      <w:bookmarkStart w:id="28" w:name="_Toc235547839"/>
+      <w:bookmarkStart w:id="29" w:name="sources-de-revenus"/>
+      <w:bookmarkEnd w:id="27"/>
       <w:r>
         <w:rPr>
           <w:lang w:val="fr-FR"/>
         </w:rPr>
         <w:t>Sources de revenus</w:t>
       </w:r>
-      <w:bookmarkEnd w:id="29"/>
+      <w:bookmarkEnd w:id="28"/>
     </w:p>
     <w:tbl>
       <w:tblPr>
@@ -8059,16 +8059,16 @@
           <w:lang w:val="fr-FR"/>
         </w:rPr>
       </w:pPr>
-      <w:bookmarkStart w:id="30" w:name="ressources-clés"/>
-      <w:bookmarkStart w:id="31" w:name="_Toc235547840"/>
-      <w:bookmarkEnd w:id="28"/>
+      <w:bookmarkStart w:id="30" w:name="_Toc235547840"/>
+      <w:bookmarkStart w:id="31" w:name="ressources-clés"/>
+      <w:bookmarkEnd w:id="29"/>
       <w:r>
         <w:rPr>
           <w:lang w:val="fr-FR"/>
         </w:rPr>
         <w:t>Ressources clés</w:t>
       </w:r>
-      <w:bookmarkEnd w:id="31"/>
+      <w:bookmarkEnd w:id="30"/>
     </w:p>
     <w:p>
       <w:pPr>
@@ -8249,16 +8249,16 @@
           <w:lang w:val="fr-FR"/>
         </w:rPr>
       </w:pPr>
-      <w:bookmarkStart w:id="32" w:name="coûts"/>
-      <w:bookmarkStart w:id="33" w:name="_Toc235547841"/>
-      <w:bookmarkEnd w:id="30"/>
+      <w:bookmarkStart w:id="32" w:name="_Toc235547841"/>
+      <w:bookmarkStart w:id="33" w:name="coûts"/>
+      <w:bookmarkEnd w:id="31"/>
       <w:r>
         <w:rPr>
           <w:lang w:val="fr-FR"/>
         </w:rPr>
         <w:t>Coûts</w:t>
       </w:r>
-      <w:bookmarkEnd w:id="33"/>
+      <w:bookmarkEnd w:id="32"/>
     </w:p>
     <w:p>
       <w:pPr>
@@ -8445,7 +8445,7 @@
           <w:lang w:val="fr-FR"/>
         </w:rPr>
         <w:pict w14:anchorId="20E6C0A2">
-          <v:rect id="_x0000_i1669" style="width:0;height:1.5pt" o:hralign="center" o:bullet="t" o:hrstd="t" o:hr="t"/>
+          <v:rect id="_x0000_i1195" style="width:0;height:1.5pt" o:hralign="center" o:bullet="t" o:hrstd="t" o:hr="t"/>
         </w:pict>
       </w:r>
     </w:p>
@@ -8470,17 +8470,17 @@
           <w:lang w:val="fr-FR"/>
         </w:rPr>
       </w:pPr>
-      <w:bookmarkStart w:id="34" w:name="grille-tarifaire-référence-produit"/>
-      <w:bookmarkStart w:id="35" w:name="_Toc235547842"/>
-      <w:bookmarkEnd w:id="20"/>
-      <w:bookmarkEnd w:id="32"/>
+      <w:bookmarkStart w:id="34" w:name="_Toc235547842"/>
+      <w:bookmarkStart w:id="35" w:name="grille-tarifaire-référence-produit"/>
+      <w:bookmarkEnd w:id="21"/>
+      <w:bookmarkEnd w:id="33"/>
       <w:r>
         <w:rPr>
           <w:lang w:val="fr-FR"/>
         </w:rPr>
         <w:t>5. Grille tarifaire (référence produit)</w:t>
       </w:r>
-      <w:bookmarkEnd w:id="35"/>
+      <w:bookmarkEnd w:id="34"/>
     </w:p>
     <w:p>
       <w:pPr>
@@ -9654,81 +9654,60 @@
           <w:lang w:val="fr-FR"/>
         </w:rPr>
         <w:pict w14:anchorId="7E01125B">
-          <v:rect id="_x0000_i1670" style="width:0;height:1.5pt" o:hralign="center" o:bullet="t" o:hrstd="t" o:hr="t"/>
+          <v:rect id="_x0000_i1196" style="width:0;height:1.5pt" o:hralign="center" o:bullet="t" o:hrstd="t" o:hr="t"/>
         </w:pict>
       </w:r>
     </w:p>
     <w:p>
       <w:pPr>
-        <w:rPr>
-          <w:lang w:val="fr-FR"/>
-        </w:rPr>
-      </w:pPr>
+        <w:pStyle w:val="Titre2"/>
+        <w:rPr>
+          <w:lang w:val="fr-FR"/>
+        </w:rPr>
+      </w:pPr>
+      <w:bookmarkStart w:id="36" w:name="_Toc235547843"/>
+      <w:bookmarkStart w:id="37" w:name="hypothèses-du-prévisionnel"/>
+      <w:bookmarkEnd w:id="35"/>
+      <w:r>
+        <w:rPr>
+          <w:lang w:val="fr-FR"/>
+        </w:rPr>
+        <w:t>6. Hypothèses du prévisionnel</w:t>
+      </w:r>
+      <w:bookmarkEnd w:id="36"/>
     </w:p>
     <w:p>
       <w:pPr>
-        <w:rPr>
-          <w:lang w:val="fr-FR"/>
-        </w:rPr>
-      </w:pPr>
+        <w:pStyle w:val="FirstParagraph"/>
+        <w:rPr>
+          <w:lang w:val="fr-FR"/>
+        </w:rPr>
+      </w:pPr>
+      <w:r>
+        <w:rPr>
+          <w:i/>
+          <w:iCs/>
+          <w:lang w:val="fr-FR"/>
+        </w:rPr>
+        <w:t>Source : « hypothèses BP.docx » · grille tarifaire produit juillet 2026</w:t>
+      </w:r>
     </w:p>
     <w:p>
       <w:pPr>
-        <w:rPr>
-          <w:lang w:val="fr-FR"/>
-        </w:rPr>
-      </w:pPr>
-    </w:p>
-    <w:p>
-      <w:pPr>
-        <w:pStyle w:val="Titre2"/>
-        <w:rPr>
-          <w:lang w:val="fr-FR"/>
-        </w:rPr>
-      </w:pPr>
-      <w:bookmarkStart w:id="36" w:name="hypothèses-du-prévisionnel"/>
-      <w:bookmarkStart w:id="37" w:name="_Toc235547843"/>
-      <w:bookmarkEnd w:id="34"/>
-      <w:r>
-        <w:rPr>
-          <w:lang w:val="fr-FR"/>
-        </w:rPr>
-        <w:t>6. Hypothèses du prévisionnel</w:t>
-      </w:r>
-      <w:bookmarkEnd w:id="37"/>
-    </w:p>
-    <w:p>
-      <w:pPr>
-        <w:pStyle w:val="FirstParagraph"/>
-        <w:rPr>
-          <w:lang w:val="fr-FR"/>
-        </w:rPr>
-      </w:pPr>
-      <w:r>
-        <w:rPr>
-          <w:i/>
-          <w:iCs/>
-          <w:lang w:val="fr-FR"/>
-        </w:rPr>
-        <w:t>Source : « hypothèses BP.docx » · grille tarifaire produit juillet 2026</w:t>
-      </w:r>
-    </w:p>
-    <w:p>
-      <w:pPr>
         <w:pStyle w:val="Titre3"/>
         <w:rPr>
           <w:lang w:val="fr-FR"/>
         </w:rPr>
       </w:pPr>
-      <w:bookmarkStart w:id="38" w:name="paramètres-généraux"/>
-      <w:bookmarkStart w:id="39" w:name="_Toc235547844"/>
+      <w:bookmarkStart w:id="38" w:name="_Toc235547844"/>
+      <w:bookmarkStart w:id="39" w:name="paramètres-généraux"/>
       <w:r>
         <w:rPr>
           <w:lang w:val="fr-FR"/>
         </w:rPr>
         <w:t>6.1 Paramètres généraux</w:t>
       </w:r>
-      <w:bookmarkEnd w:id="39"/>
+      <w:bookmarkEnd w:id="38"/>
     </w:p>
     <w:tbl>
       <w:tblPr>
@@ -10051,14 +10030,21 @@
     </w:tbl>
     <w:p>
       <w:pPr>
+        <w:rPr>
+          <w:lang w:val="fr-FR"/>
+        </w:rPr>
+      </w:pPr>
+      <w:bookmarkStart w:id="40" w:name="_Toc235547845"/>
+      <w:bookmarkStart w:id="41" w:name="attrition-clientèlechurn"/>
+      <w:bookmarkEnd w:id="39"/>
+    </w:p>
+    <w:p>
+      <w:pPr>
         <w:pStyle w:val="Titre3"/>
         <w:rPr>
           <w:lang w:val="fr-FR"/>
         </w:rPr>
       </w:pPr>
-      <w:bookmarkStart w:id="40" w:name="attrition-clientèlechurn"/>
-      <w:bookmarkStart w:id="41" w:name="_Toc235547845"/>
-      <w:bookmarkEnd w:id="38"/>
       <w:r>
         <w:rPr>
           <w:lang w:val="fr-FR"/>
@@ -10072,7 +10058,7 @@
         </w:rPr>
         <w:footnoteReference w:id="34"/>
       </w:r>
-      <w:bookmarkEnd w:id="41"/>
+      <w:bookmarkEnd w:id="40"/>
     </w:p>
     <w:tbl>
       <w:tblPr>
@@ -10144,7 +10130,6 @@
               <w:rPr>
                 <w:lang w:val="fr-FR"/>
               </w:rPr>
-              <w:lastRenderedPageBreak/>
               <w:t>Début de l’attrition</w:t>
             </w:r>
           </w:p>
@@ -10279,16 +10264,17 @@
           <w:lang w:val="fr-FR"/>
         </w:rPr>
       </w:pPr>
-      <w:bookmarkStart w:id="42" w:name="Xffcb578a8dacf736cf2fdcdbd560de6809644e1"/>
-      <w:bookmarkStart w:id="43" w:name="_Toc235547846"/>
-      <w:bookmarkEnd w:id="40"/>
-      <w:r>
-        <w:rPr>
-          <w:lang w:val="fr-FR"/>
-        </w:rPr>
+      <w:bookmarkStart w:id="42" w:name="_Toc235547846"/>
+      <w:bookmarkStart w:id="43" w:name="Xffcb578a8dacf736cf2fdcdbd560de6809644e1"/>
+      <w:bookmarkEnd w:id="41"/>
+      <w:r>
+        <w:rPr>
+          <w:lang w:val="fr-FR"/>
+        </w:rPr>
+        <w:lastRenderedPageBreak/>
         <w:t>6.3 Effectifs clients (fin d’année, cumul) — scénario de référence</w:t>
       </w:r>
-      <w:bookmarkEnd w:id="43"/>
+      <w:bookmarkEnd w:id="42"/>
     </w:p>
     <w:tbl>
       <w:tblPr>
@@ -11000,21 +10986,31 @@
     </w:p>
     <w:p>
       <w:pPr>
+        <w:pStyle w:val="Corpsdetexte"/>
+        <w:rPr>
+          <w:i/>
+          <w:iCs/>
+          <w:lang w:val="fr-FR"/>
+        </w:rPr>
+      </w:pPr>
+    </w:p>
+    <w:p>
+      <w:pPr>
         <w:pStyle w:val="Titre3"/>
         <w:rPr>
           <w:lang w:val="fr-FR"/>
         </w:rPr>
       </w:pPr>
-      <w:bookmarkStart w:id="44" w:name="paramètres-commerciaux"/>
-      <w:bookmarkStart w:id="45" w:name="_Toc235547847"/>
-      <w:bookmarkEnd w:id="42"/>
+      <w:bookmarkStart w:id="44" w:name="_Toc235547847"/>
+      <w:bookmarkStart w:id="45" w:name="paramètres-commerciaux"/>
+      <w:bookmarkEnd w:id="43"/>
       <w:r>
         <w:rPr>
           <w:lang w:val="fr-FR"/>
         </w:rPr>
         <w:t>6.4 Paramètres commerciaux</w:t>
       </w:r>
-      <w:bookmarkEnd w:id="45"/>
+      <w:bookmarkEnd w:id="44"/>
     </w:p>
     <w:tbl>
       <w:tblPr>
@@ -11557,6 +11553,8 @@
       <w:pPr>
         <w:pStyle w:val="Corpsdetexte"/>
         <w:rPr>
+          <w:i/>
+          <w:iCs/>
           <w:lang w:val="fr-FR"/>
         </w:rPr>
       </w:pPr>
@@ -11589,21 +11587,29 @@
     </w:p>
     <w:p>
       <w:pPr>
+        <w:pStyle w:val="Corpsdetexte"/>
+        <w:rPr>
+          <w:lang w:val="fr-FR"/>
+        </w:rPr>
+      </w:pPr>
+    </w:p>
+    <w:p>
+      <w:pPr>
         <w:pStyle w:val="Titre3"/>
         <w:rPr>
           <w:lang w:val="fr-FR"/>
         </w:rPr>
       </w:pPr>
-      <w:bookmarkStart w:id="46" w:name="tarif-rayonnement"/>
-      <w:bookmarkStart w:id="47" w:name="_Toc235547848"/>
-      <w:bookmarkEnd w:id="44"/>
+      <w:bookmarkStart w:id="46" w:name="_Toc235547848"/>
+      <w:bookmarkStart w:id="47" w:name="tarif-rayonnement"/>
+      <w:bookmarkEnd w:id="45"/>
       <w:r>
         <w:rPr>
           <w:lang w:val="fr-FR"/>
         </w:rPr>
         <w:t>6.5 Tarif Rayonnement</w:t>
       </w:r>
-      <w:bookmarkEnd w:id="47"/>
+      <w:bookmarkEnd w:id="46"/>
     </w:p>
     <w:tbl>
       <w:tblPr>
@@ -11816,21 +11822,57 @@
     </w:tbl>
     <w:p>
       <w:pPr>
+        <w:rPr>
+          <w:lang w:val="fr-FR"/>
+        </w:rPr>
+      </w:pPr>
+      <w:bookmarkStart w:id="48" w:name="_Toc235547849"/>
+      <w:bookmarkStart w:id="49" w:name="sous-traitance-développeurs"/>
+      <w:bookmarkEnd w:id="47"/>
+    </w:p>
+    <w:p>
+      <w:pPr>
+        <w:rPr>
+          <w:lang w:val="fr-FR"/>
+        </w:rPr>
+      </w:pPr>
+    </w:p>
+    <w:p>
+      <w:pPr>
+        <w:rPr>
+          <w:lang w:val="fr-FR"/>
+        </w:rPr>
+      </w:pPr>
+    </w:p>
+    <w:p>
+      <w:pPr>
+        <w:rPr>
+          <w:lang w:val="fr-FR"/>
+        </w:rPr>
+      </w:pPr>
+    </w:p>
+    <w:p>
+      <w:pPr>
+        <w:rPr>
+          <w:lang w:val="fr-FR"/>
+        </w:rPr>
+      </w:pPr>
+    </w:p>
+    <w:p>
+      <w:pPr>
         <w:pStyle w:val="Titre3"/>
         <w:rPr>
           <w:lang w:val="fr-FR"/>
         </w:rPr>
       </w:pPr>
-      <w:bookmarkStart w:id="48" w:name="sous-traitance-développeurs"/>
-      <w:bookmarkStart w:id="49" w:name="_Toc235547849"/>
-      <w:bookmarkEnd w:id="46"/>
-      <w:r>
-        <w:rPr>
-          <w:lang w:val="fr-FR"/>
-        </w:rPr>
+      <w:r>
+        <w:rPr>
+          <w:lang w:val="fr-FR"/>
+        </w:rPr>
+        <w:lastRenderedPageBreak/>
         <w:t>6.6 Sous-traitance développeurs</w:t>
       </w:r>
-      <w:bookmarkEnd w:id="49"/>
+      <w:bookmarkEnd w:id="48"/>
     </w:p>
     <w:tbl>
       <w:tblPr>
@@ -12144,14 +12186,7 @@
               <w:rPr>
                 <w:lang w:val="fr-FR"/>
               </w:rPr>
-              <w:t xml:space="preserve">2 → 5 </w:t>
-            </w:r>
-            <w:r>
-              <w:rPr>
-                <w:lang w:val="fr-FR"/>
-              </w:rPr>
-              <w:lastRenderedPageBreak/>
-              <w:t>développeurs</w:t>
+              <w:t>2 → 5 développeurs</w:t>
             </w:r>
           </w:p>
         </w:tc>
@@ -12172,15 +12207,7 @@
               <w:rPr>
                 <w:lang w:val="fr-FR"/>
               </w:rPr>
-              <w:lastRenderedPageBreak/>
-              <w:t xml:space="preserve">M1 : 2 · M7 : </w:t>
-            </w:r>
-            <w:r>
-              <w:rPr>
-                <w:lang w:val="fr-FR"/>
-              </w:rPr>
-              <w:lastRenderedPageBreak/>
-              <w:t>3 · M13 : 4 · M19+ : 5</w:t>
+              <w:t>M1 : 2 · M7 : 3 · M13 : 4 · M19+ : 5</w:t>
             </w:r>
           </w:p>
         </w:tc>
@@ -12201,15 +12228,7 @@
               <w:rPr>
                 <w:lang w:val="fr-FR"/>
               </w:rPr>
-              <w:lastRenderedPageBreak/>
-              <w:t xml:space="preserve">4 500 € </w:t>
-            </w:r>
-            <w:r>
-              <w:rPr>
-                <w:lang w:val="fr-FR"/>
-              </w:rPr>
-              <w:lastRenderedPageBreak/>
-              <w:t>HT/mois/développeur</w:t>
+              <w:t>4 500 € HT/mois/développeur</w:t>
             </w:r>
           </w:p>
         </w:tc>
@@ -12228,7 +12247,6 @@
           <w:iCs/>
           <w:lang w:val="fr-FR"/>
         </w:rPr>
-        <w:lastRenderedPageBreak/>
         <w:t>Hypothèse TJM</w:t>
       </w:r>
       <w:r>
@@ -12258,7 +12276,7 @@
           <w:lang w:val="fr-FR"/>
         </w:rPr>
         <w:pict w14:anchorId="0A2A1C68">
-          <v:rect id="_x0000_i1663" style="width:0;height:1.5pt" o:hralign="center" o:hrstd="t" o:hr="t"/>
+          <v:rect id="_x0000_i1197" style="width:0;height:1.5pt" o:hralign="center" o:hrstd="t" o:hr="t"/>
         </w:pict>
       </w:r>
     </w:p>
@@ -12270,20 +12288,13 @@
         </w:rPr>
       </w:pPr>
       <w:bookmarkStart w:id="50" w:name="prévisionnel-financier-3-scénarios"/>
-      <w:bookmarkEnd w:id="36"/>
-      <w:bookmarkEnd w:id="48"/>
-      <w:r>
-        <w:rPr>
-          <w:lang w:val="fr-FR"/>
-        </w:rPr>
-        <w:br w:type="column"/>
-      </w:r>
       <w:bookmarkStart w:id="51" w:name="_Toc235547850"/>
-      <w:r>
-        <w:rPr>
-          <w:lang w:val="fr-FR"/>
-        </w:rPr>
-        <w:lastRenderedPageBreak/>
+      <w:bookmarkEnd w:id="37"/>
+      <w:bookmarkEnd w:id="49"/>
+      <w:r>
+        <w:rPr>
+          <w:lang w:val="fr-FR"/>
+        </w:rPr>
         <w:t>7. Prévisionnel financier — 3 scénarios</w:t>
       </w:r>
       <w:bookmarkEnd w:id="51"/>
@@ -12411,6 +12422,7 @@
           <w:noProof/>
           <w:lang w:val="fr-FR"/>
         </w:rPr>
+        <w:lastRenderedPageBreak/>
         <w:drawing>
           <wp:inline distT="0" distB="0" distL="0" distR="0" wp14:anchorId="650FCC11" wp14:editId="1B36C280">
             <wp:extent cx="5184000" cy="3218138"/>
@@ -12482,7 +12494,6 @@
           <w:noProof/>
           <w:lang w:val="fr-FR"/>
         </w:rPr>
-        <w:lastRenderedPageBreak/>
         <w:drawing>
           <wp:inline distT="0" distB="0" distL="0" distR="0" wp14:anchorId="718FF0D1" wp14:editId="3A1686D9">
             <wp:extent cx="5334000" cy="3674162"/>
@@ -12542,20 +12553,29 @@
     </w:p>
     <w:p>
       <w:pPr>
+        <w:pStyle w:val="ImageCaption"/>
+        <w:rPr>
+          <w:lang w:val="fr-FR"/>
+        </w:rPr>
+      </w:pPr>
+    </w:p>
+    <w:p>
+      <w:pPr>
         <w:pStyle w:val="Titre3"/>
         <w:rPr>
           <w:lang w:val="fr-FR"/>
         </w:rPr>
       </w:pPr>
-      <w:bookmarkStart w:id="52" w:name="synthèse-annuelle-ht"/>
-      <w:bookmarkStart w:id="53" w:name="_Toc235547851"/>
-      <w:r>
-        <w:rPr>
-          <w:lang w:val="fr-FR"/>
-        </w:rPr>
+      <w:bookmarkStart w:id="52" w:name="_Toc235547851"/>
+      <w:bookmarkStart w:id="53" w:name="synthèse-annuelle-ht"/>
+      <w:r>
+        <w:rPr>
+          <w:lang w:val="fr-FR"/>
+        </w:rPr>
+        <w:lastRenderedPageBreak/>
         <w:t>7.1 Synthèse annuelle (€ HT)</w:t>
       </w:r>
-      <w:bookmarkEnd w:id="53"/>
+      <w:bookmarkEnd w:id="52"/>
     </w:p>
     <w:tbl>
       <w:tblPr>
@@ -12690,7 +12710,13 @@
               <w:rPr>
                 <w:lang w:val="fr-FR"/>
               </w:rPr>
-              <w:t>94 552</w:t>
+              <w:t xml:space="preserve">94 </w:t>
+            </w:r>
+            <w:r>
+              <w:rPr>
+                <w:lang w:val="fr-FR"/>
+              </w:rPr>
+              <w:t>425</w:t>
             </w:r>
           </w:p>
         </w:tc>
@@ -12711,7 +12737,13 @@
               <w:rPr>
                 <w:lang w:val="fr-FR"/>
               </w:rPr>
-              <w:t>136 315</w:t>
+              <w:t xml:space="preserve">136 </w:t>
+            </w:r>
+            <w:r>
+              <w:rPr>
+                <w:lang w:val="fr-FR"/>
+              </w:rPr>
+              <w:t>642</w:t>
             </w:r>
           </w:p>
         </w:tc>
@@ -12732,7 +12764,13 @@
               <w:rPr>
                 <w:lang w:val="fr-FR"/>
               </w:rPr>
-              <w:t>168 633</w:t>
+              <w:t xml:space="preserve">168 </w:t>
+            </w:r>
+            <w:r>
+              <w:rPr>
+                <w:lang w:val="fr-FR"/>
+              </w:rPr>
+              <w:t>837</w:t>
             </w:r>
           </w:p>
         </w:tc>
@@ -12867,7 +12905,19 @@
               <w:rPr>
                 <w:lang w:val="fr-FR"/>
               </w:rPr>
-              <w:t>99 606</w:t>
+              <w:t>97</w:t>
+            </w:r>
+            <w:r>
+              <w:rPr>
+                <w:lang w:val="fr-FR"/>
+              </w:rPr>
+              <w:t xml:space="preserve"> </w:t>
+            </w:r>
+            <w:r>
+              <w:rPr>
+                <w:lang w:val="fr-FR"/>
+              </w:rPr>
+              <w:t>557</w:t>
             </w:r>
           </w:p>
         </w:tc>
@@ -12888,7 +12938,13 @@
               <w:rPr>
                 <w:lang w:val="fr-FR"/>
               </w:rPr>
-              <w:t>46 053</w:t>
+              <w:t xml:space="preserve">46 </w:t>
+            </w:r>
+            <w:r>
+              <w:rPr>
+                <w:lang w:val="fr-FR"/>
+              </w:rPr>
+              <w:t>762</w:t>
             </w:r>
           </w:p>
         </w:tc>
@@ -12909,7 +12965,13 @@
               <w:rPr>
                 <w:lang w:val="fr-FR"/>
               </w:rPr>
-              <w:t>−448 849</w:t>
+              <w:t>−44</w:t>
+            </w:r>
+            <w:r>
+              <w:rPr>
+                <w:lang w:val="fr-FR"/>
+              </w:rPr>
+              <w:t>6 756</w:t>
             </w:r>
           </w:p>
         </w:tc>
@@ -12953,7 +13015,7 @@
               <w:rPr>
                 <w:lang w:val="fr-FR"/>
               </w:rPr>
-              <w:t>101 707</w:t>
+              <w:t>99 657</w:t>
             </w:r>
           </w:p>
         </w:tc>
@@ -12974,7 +13036,13 @@
               <w:rPr>
                 <w:lang w:val="fr-FR"/>
               </w:rPr>
-              <w:t>48 154</w:t>
+              <w:t xml:space="preserve">48 </w:t>
+            </w:r>
+            <w:r>
+              <w:rPr>
+                <w:lang w:val="fr-FR"/>
+              </w:rPr>
+              <w:t>862</w:t>
             </w:r>
           </w:p>
         </w:tc>
@@ -12995,7 +13063,13 @@
               <w:rPr>
                 <w:lang w:val="fr-FR"/>
               </w:rPr>
-              <w:t>−446 749</w:t>
+              <w:t>−44</w:t>
+            </w:r>
+            <w:r>
+              <w:rPr>
+                <w:lang w:val="fr-FR"/>
+              </w:rPr>
+              <w:t>4 656</w:t>
             </w:r>
           </w:p>
         </w:tc>
@@ -13092,7 +13166,7 @@
         </w:rPr>
       </w:pPr>
       <w:bookmarkStart w:id="54" w:name="scénario-de-référence-compte-de-résultat"/>
-      <w:bookmarkEnd w:id="52"/>
+      <w:bookmarkEnd w:id="53"/>
     </w:p>
     <w:p>
       <w:pPr>
@@ -13257,7 +13331,13 @@
               <w:rPr>
                 <w:lang w:val="fr-FR"/>
               </w:rPr>
-              <w:t>8 163</w:t>
+              <w:t>8 1</w:t>
+            </w:r>
+            <w:r>
+              <w:rPr>
+                <w:lang w:val="fr-FR"/>
+              </w:rPr>
+              <w:t>32</w:t>
             </w:r>
           </w:p>
         </w:tc>
@@ -13278,7 +13358,7 @@
               <w:rPr>
                 <w:lang w:val="fr-FR"/>
               </w:rPr>
-              <w:t>41 793</w:t>
+              <w:t>42 211</w:t>
             </w:r>
           </w:p>
         </w:tc>
@@ -13299,7 +13379,13 @@
               <w:rPr>
                 <w:lang w:val="fr-FR"/>
               </w:rPr>
-              <w:t>105 539</w:t>
+              <w:t xml:space="preserve">105 </w:t>
+            </w:r>
+            <w:r>
+              <w:rPr>
+                <w:lang w:val="fr-FR"/>
+              </w:rPr>
+              <w:t>865</w:t>
             </w:r>
           </w:p>
         </w:tc>
@@ -13343,7 +13429,7 @@
               <w:rPr>
                 <w:lang w:val="fr-FR"/>
               </w:rPr>
-              <w:t>66</w:t>
+              <w:t>65</w:t>
             </w:r>
           </w:p>
         </w:tc>
@@ -13364,7 +13450,7 @@
               <w:rPr>
                 <w:lang w:val="fr-FR"/>
               </w:rPr>
-              <w:t>715</w:t>
+              <w:t>717</w:t>
             </w:r>
           </w:p>
         </w:tc>
@@ -13385,7 +13471,13 @@
               <w:rPr>
                 <w:lang w:val="fr-FR"/>
               </w:rPr>
-              <w:t>2 442</w:t>
+              <w:t>2 44</w:t>
+            </w:r>
+            <w:r>
+              <w:rPr>
+                <w:lang w:val="fr-FR"/>
+              </w:rPr>
+              <w:t>4</w:t>
             </w:r>
           </w:p>
         </w:tc>
@@ -13517,30 +13609,15 @@
                 <w:bCs/>
                 <w:lang w:val="fr-FR"/>
               </w:rPr>
-              <w:t>8 228</w:t>
-            </w:r>
-          </w:p>
-        </w:tc>
-        <w:tc>
-          <w:tcPr>
-            <w:tcW w:w="2096" w:type="dxa"/>
-            <w:vAlign w:val="center"/>
-          </w:tcPr>
-          <w:p>
-            <w:pPr>
-              <w:pStyle w:val="Compact"/>
-              <w:jc w:val="center"/>
-              <w:rPr>
-                <w:lang w:val="fr-FR"/>
-              </w:rPr>
-            </w:pPr>
+              <w:t xml:space="preserve">8 </w:t>
+            </w:r>
             <w:r>
               <w:rPr>
                 <w:b/>
                 <w:bCs/>
                 <w:lang w:val="fr-FR"/>
               </w:rPr>
-              <w:t>55 009</w:t>
+              <w:t>197</w:t>
             </w:r>
           </w:p>
         </w:tc>
@@ -13563,7 +13640,46 @@
                 <w:bCs/>
                 <w:lang w:val="fr-FR"/>
               </w:rPr>
-              <w:t>136 315</w:t>
+              <w:t xml:space="preserve">55 </w:t>
+            </w:r>
+            <w:r>
+              <w:rPr>
+                <w:b/>
+                <w:bCs/>
+                <w:lang w:val="fr-FR"/>
+              </w:rPr>
+              <w:t>428</w:t>
+            </w:r>
+          </w:p>
+        </w:tc>
+        <w:tc>
+          <w:tcPr>
+            <w:tcW w:w="2096" w:type="dxa"/>
+            <w:vAlign w:val="center"/>
+          </w:tcPr>
+          <w:p>
+            <w:pPr>
+              <w:pStyle w:val="Compact"/>
+              <w:jc w:val="center"/>
+              <w:rPr>
+                <w:lang w:val="fr-FR"/>
+              </w:rPr>
+            </w:pPr>
+            <w:r>
+              <w:rPr>
+                <w:b/>
+                <w:bCs/>
+                <w:lang w:val="fr-FR"/>
+              </w:rPr>
+              <w:t xml:space="preserve">136 </w:t>
+            </w:r>
+            <w:r>
+              <w:rPr>
+                <w:b/>
+                <w:bCs/>
+                <w:lang w:val="fr-FR"/>
+              </w:rPr>
+              <w:t>642</w:t>
             </w:r>
           </w:p>
         </w:tc>
@@ -13861,30 +13977,15 @@
                 <w:bCs/>
                 <w:lang w:val="fr-FR"/>
               </w:rPr>
-              <w:t>≈ 656</w:t>
-            </w:r>
-          </w:p>
-        </w:tc>
-        <w:tc>
-          <w:tcPr>
-            <w:tcW w:w="2096" w:type="dxa"/>
-            <w:vAlign w:val="center"/>
-          </w:tcPr>
-          <w:p>
-            <w:pPr>
-              <w:pStyle w:val="Compact"/>
-              <w:jc w:val="center"/>
-              <w:rPr>
-                <w:lang w:val="fr-FR"/>
-              </w:rPr>
-            </w:pPr>
+              <w:t xml:space="preserve">≈ </w:t>
+            </w:r>
             <w:r>
               <w:rPr>
                 <w:b/>
                 <w:bCs/>
                 <w:lang w:val="fr-FR"/>
               </w:rPr>
-              <w:t>≈ −12 642</w:t>
+              <w:t>625</w:t>
             </w:r>
           </w:p>
         </w:tc>
@@ -13907,7 +14008,46 @@
                 <w:bCs/>
                 <w:lang w:val="fr-FR"/>
               </w:rPr>
-              <w:t>≈ 58 039</w:t>
+              <w:t xml:space="preserve">≈ −12 </w:t>
+            </w:r>
+            <w:r>
+              <w:rPr>
+                <w:b/>
+                <w:bCs/>
+                <w:lang w:val="fr-FR"/>
+              </w:rPr>
+              <w:t>227</w:t>
+            </w:r>
+          </w:p>
+        </w:tc>
+        <w:tc>
+          <w:tcPr>
+            <w:tcW w:w="2096" w:type="dxa"/>
+            <w:vAlign w:val="center"/>
+          </w:tcPr>
+          <w:p>
+            <w:pPr>
+              <w:pStyle w:val="Compact"/>
+              <w:jc w:val="center"/>
+              <w:rPr>
+                <w:lang w:val="fr-FR"/>
+              </w:rPr>
+            </w:pPr>
+            <w:r>
+              <w:rPr>
+                <w:b/>
+                <w:bCs/>
+                <w:lang w:val="fr-FR"/>
+              </w:rPr>
+              <w:t xml:space="preserve">≈ 58 </w:t>
+            </w:r>
+            <w:r>
+              <w:rPr>
+                <w:b/>
+                <w:bCs/>
+                <w:lang w:val="fr-FR"/>
+              </w:rPr>
+              <w:t>363</w:t>
             </w:r>
           </w:p>
         </w:tc>
@@ -13915,21 +14055,28 @@
     </w:tbl>
     <w:p>
       <w:pPr>
+        <w:rPr>
+          <w:lang w:val="fr-FR"/>
+        </w:rPr>
+      </w:pPr>
+      <w:bookmarkStart w:id="56" w:name="_Toc235547853"/>
+      <w:bookmarkStart w:id="57" w:name="X82f66c72ae39b42054da972dc37c69b4ace833f"/>
+      <w:bookmarkEnd w:id="54"/>
+    </w:p>
+    <w:p>
+      <w:pPr>
         <w:pStyle w:val="Titre3"/>
         <w:rPr>
           <w:lang w:val="fr-FR"/>
         </w:rPr>
       </w:pPr>
-      <w:bookmarkStart w:id="56" w:name="X82f66c72ae39b42054da972dc37c69b4ace833f"/>
-      <w:bookmarkStart w:id="57" w:name="_Toc235547853"/>
-      <w:bookmarkEnd w:id="54"/>
       <w:r>
         <w:rPr>
           <w:lang w:val="fr-FR"/>
         </w:rPr>
         <w:t>7.3 Indicateurs récurrents (référence, fin d’année)</w:t>
       </w:r>
-      <w:bookmarkEnd w:id="57"/>
+      <w:bookmarkEnd w:id="56"/>
     </w:p>
     <w:tbl>
       <w:tblPr>
@@ -14514,21 +14661,28 @@
     </w:tbl>
     <w:p>
       <w:pPr>
+        <w:rPr>
+          <w:lang w:val="fr-FR"/>
+        </w:rPr>
+      </w:pPr>
+      <w:bookmarkStart w:id="58" w:name="_Toc235547854"/>
+      <w:bookmarkStart w:id="59" w:name="lecture-stratégique"/>
+      <w:bookmarkEnd w:id="57"/>
+    </w:p>
+    <w:p>
+      <w:pPr>
         <w:pStyle w:val="Titre3"/>
         <w:rPr>
           <w:lang w:val="fr-FR"/>
         </w:rPr>
       </w:pPr>
-      <w:bookmarkStart w:id="58" w:name="lecture-stratégique"/>
-      <w:bookmarkStart w:id="59" w:name="_Toc235547854"/>
-      <w:bookmarkEnd w:id="56"/>
       <w:r>
         <w:rPr>
           <w:lang w:val="fr-FR"/>
         </w:rPr>
         <w:t>7.4 Lecture stratégique</w:t>
       </w:r>
-      <w:bookmarkEnd w:id="59"/>
+      <w:bookmarkEnd w:id="58"/>
     </w:p>
     <w:p>
       <w:pPr>
@@ -14612,6 +14766,7 @@
           <w:bCs/>
           <w:lang w:val="fr-FR"/>
         </w:rPr>
+        <w:lastRenderedPageBreak/>
         <w:t>Ambitieux</w:t>
       </w:r>
       <w:r>
@@ -14648,15 +14803,6 @@
           <w:lang w:val="fr-FR"/>
         </w:rPr>
       </w:pPr>
-      <w:r>
-        <w:rPr>
-          <w:lang w:val="fr-FR"/>
-        </w:rPr>
-        <w:lastRenderedPageBreak/>
-        <w:pict w14:anchorId="0D4015AA">
-          <v:rect id="_x0000_i1664" style="width:0;height:1.5pt" o:hralign="center" o:bullet="t" o:hrstd="t" o:hr="t"/>
-        </w:pict>
-      </w:r>
     </w:p>
     <w:p>
       <w:pPr>
@@ -14665,17 +14811,17 @@
           <w:lang w:val="fr-FR"/>
         </w:rPr>
       </w:pPr>
-      <w:bookmarkStart w:id="60" w:name="économie-unitaire-et-attrition"/>
-      <w:bookmarkStart w:id="61" w:name="_Toc235547855"/>
+      <w:bookmarkStart w:id="60" w:name="_Toc235547855"/>
+      <w:bookmarkStart w:id="61" w:name="économie-unitaire-et-attrition"/>
       <w:bookmarkEnd w:id="50"/>
-      <w:bookmarkEnd w:id="58"/>
+      <w:bookmarkEnd w:id="59"/>
       <w:r>
         <w:rPr>
           <w:lang w:val="fr-FR"/>
         </w:rPr>
         <w:t>8. Économie unitaire et attrition</w:t>
       </w:r>
-      <w:bookmarkEnd w:id="61"/>
+      <w:bookmarkEnd w:id="60"/>
     </w:p>
     <w:p>
       <w:pPr>
@@ -14684,8 +14830,8 @@
           <w:lang w:val="fr-FR"/>
         </w:rPr>
       </w:pPr>
-      <w:bookmarkStart w:id="62" w:name="X830b126fc4b2daf0dba5d6cea3d5f7e4c38e3d2"/>
-      <w:bookmarkStart w:id="63" w:name="_Toc235547856"/>
+      <w:bookmarkStart w:id="62" w:name="_Toc235547856"/>
+      <w:bookmarkStart w:id="63" w:name="X830b126fc4b2daf0dba5d6cea3d5f7e4c38e3d2"/>
       <w:r>
         <w:rPr>
           <w:lang w:val="fr-FR"/>
@@ -14705,7 +14851,7 @@
         </w:rPr>
         <w:t xml:space="preserve"> estimée (ordre de grandeur)</w:t>
       </w:r>
-      <w:bookmarkEnd w:id="63"/>
+      <w:bookmarkEnd w:id="62"/>
     </w:p>
     <w:tbl>
       <w:tblPr>
@@ -15182,16 +15328,16 @@
           <w:lang w:val="fr-FR"/>
         </w:rPr>
       </w:pPr>
-      <w:bookmarkStart w:id="64" w:name="répartition-des-revenus-a3-référence"/>
-      <w:bookmarkStart w:id="65" w:name="_Toc235547857"/>
-      <w:bookmarkEnd w:id="62"/>
+      <w:bookmarkStart w:id="64" w:name="_Toc235547857"/>
+      <w:bookmarkStart w:id="65" w:name="répartition-des-revenus-a3-référence"/>
+      <w:bookmarkEnd w:id="63"/>
       <w:r>
         <w:rPr>
           <w:lang w:val="fr-FR"/>
         </w:rPr>
         <w:t>Répartition des revenus A3 (référence)</w:t>
       </w:r>
-      <w:bookmarkEnd w:id="65"/>
+      <w:bookmarkEnd w:id="64"/>
     </w:p>
     <w:tbl>
       <w:tblPr>
@@ -15673,14 +15819,6 @@
           <w:lang w:val="fr-FR"/>
         </w:rPr>
       </w:pPr>
-      <w:r>
-        <w:rPr>
-          <w:lang w:val="fr-FR"/>
-        </w:rPr>
-        <w:pict w14:anchorId="6E8BE4A2">
-          <v:rect id="_x0000_i1665" style="width:0;height:1.5pt" o:hralign="center" o:hrstd="t" o:hr="t"/>
-        </w:pict>
-      </w:r>
     </w:p>
     <w:p>
       <w:pPr>
@@ -15689,10 +15827,10 @@
           <w:lang w:val="fr-FR"/>
         </w:rPr>
       </w:pPr>
-      <w:bookmarkStart w:id="66" w:name="stratégie-de-mise-sur-le-marchégtm"/>
-      <w:bookmarkStart w:id="67" w:name="_Toc235547858"/>
-      <w:bookmarkEnd w:id="60"/>
-      <w:bookmarkEnd w:id="64"/>
+      <w:bookmarkStart w:id="66" w:name="_Toc235547858"/>
+      <w:bookmarkStart w:id="67" w:name="stratégie-de-mise-sur-le-marchégtm"/>
+      <w:bookmarkEnd w:id="61"/>
+      <w:bookmarkEnd w:id="65"/>
       <w:r>
         <w:rPr>
           <w:lang w:val="fr-FR"/>
@@ -15706,7 +15844,7 @@
         </w:rPr>
         <w:footnoteReference w:id="46"/>
       </w:r>
-      <w:bookmarkEnd w:id="67"/>
+      <w:bookmarkEnd w:id="66"/>
     </w:p>
     <w:p>
       <w:pPr>
@@ -15715,15 +15853,15 @@
           <w:lang w:val="fr-FR"/>
         </w:rPr>
       </w:pPr>
-      <w:bookmarkStart w:id="68" w:name="phase-1-a1-validation-0-25-clients"/>
-      <w:bookmarkStart w:id="69" w:name="_Toc235547859"/>
+      <w:bookmarkStart w:id="68" w:name="_Toc235547859"/>
+      <w:bookmarkStart w:id="69" w:name="phase-1-a1-validation-0-25-clients"/>
       <w:r>
         <w:rPr>
           <w:lang w:val="fr-FR"/>
         </w:rPr>
         <w:t>Phase 1 — A1 : Validation (0 → 25 clients)</w:t>
       </w:r>
-      <w:bookmarkEnd w:id="69"/>
+      <w:bookmarkEnd w:id="68"/>
     </w:p>
     <w:p>
       <w:pPr>
@@ -15900,16 +16038,17 @@
           <w:lang w:val="fr-FR"/>
         </w:rPr>
       </w:pPr>
-      <w:bookmarkStart w:id="70" w:name="phase-2-a2-accélération-25-68-clients"/>
-      <w:bookmarkStart w:id="71" w:name="_Toc235547860"/>
-      <w:bookmarkEnd w:id="68"/>
-      <w:r>
-        <w:rPr>
-          <w:lang w:val="fr-FR"/>
-        </w:rPr>
+      <w:bookmarkStart w:id="70" w:name="_Toc235547860"/>
+      <w:bookmarkStart w:id="71" w:name="phase-2-a2-accélération-25-68-clients"/>
+      <w:bookmarkEnd w:id="69"/>
+      <w:r>
+        <w:rPr>
+          <w:lang w:val="fr-FR"/>
+        </w:rPr>
+        <w:lastRenderedPageBreak/>
         <w:t>Phase 2 — A2 : Accélération (25 → 68 clients)</w:t>
       </w:r>
-      <w:bookmarkEnd w:id="71"/>
+      <w:bookmarkEnd w:id="70"/>
     </w:p>
     <w:p>
       <w:pPr>
@@ -16044,7 +16183,6 @@
         <w:rPr>
           <w:lang w:val="fr-FR"/>
         </w:rPr>
-        <w:lastRenderedPageBreak/>
         <w:t>Activation réseaux (DCA, festivals photo Arles / Perpignan)</w:t>
       </w:r>
     </w:p>
@@ -16055,16 +16193,16 @@
           <w:lang w:val="fr-FR"/>
         </w:rPr>
       </w:pPr>
-      <w:bookmarkStart w:id="72" w:name="X83d4a8d15908a5fe7db8103344ddea395b5d12b"/>
-      <w:bookmarkStart w:id="73" w:name="_Toc235547861"/>
-      <w:bookmarkEnd w:id="70"/>
+      <w:bookmarkStart w:id="72" w:name="_Toc235547861"/>
+      <w:bookmarkStart w:id="73" w:name="X83d4a8d15908a5fe7db8103344ddea395b5d12b"/>
+      <w:bookmarkEnd w:id="71"/>
       <w:r>
         <w:rPr>
           <w:lang w:val="fr-FR"/>
         </w:rPr>
         <w:t>Phase 3 — A3 : Déploiement régional (68 → 128 clients)</w:t>
       </w:r>
-      <w:bookmarkEnd w:id="73"/>
+      <w:bookmarkEnd w:id="72"/>
     </w:p>
     <w:p>
       <w:pPr>
@@ -16222,7 +16360,7 @@
           <w:lang w:val="fr-FR"/>
         </w:rPr>
         <w:pict w14:anchorId="07CF1ECE">
-          <v:rect id="_x0000_i1666" style="width:0;height:1.5pt" o:hralign="center" o:hrstd="t" o:hr="t"/>
+          <v:rect id="_x0000_i1199" style="width:0;height:1.5pt" o:hralign="center" o:hrstd="t" o:hr="t"/>
         </w:pict>
       </w:r>
     </w:p>
@@ -16233,17 +16371,17 @@
           <w:lang w:val="fr-FR"/>
         </w:rPr>
       </w:pPr>
-      <w:bookmarkStart w:id="74" w:name="X95ff957d15d893d9b19d41a9b10d309819d5b25"/>
-      <w:bookmarkStart w:id="75" w:name="_Toc235547862"/>
-      <w:bookmarkEnd w:id="66"/>
-      <w:bookmarkEnd w:id="72"/>
+      <w:bookmarkStart w:id="74" w:name="_Toc235547862"/>
+      <w:bookmarkStart w:id="75" w:name="X95ff957d15d893d9b19d41a9b10d309819d5b25"/>
+      <w:bookmarkEnd w:id="67"/>
+      <w:bookmarkEnd w:id="73"/>
       <w:r>
         <w:rPr>
           <w:lang w:val="fr-FR"/>
         </w:rPr>
         <w:t>10. Feuille de route produit (alignée sur le code source)</w:t>
       </w:r>
-      <w:bookmarkEnd w:id="75"/>
+      <w:bookmarkEnd w:id="74"/>
     </w:p>
     <w:tbl>
       <w:tblPr>
@@ -16873,7 +17011,7 @@
           <w:lang w:val="fr-FR"/>
         </w:rPr>
         <w:pict w14:anchorId="2FDD735E">
-          <v:rect id="_x0000_i1667" style="width:0;height:1.5pt" o:hralign="center" o:hrstd="t" o:hr="t"/>
+          <v:rect id="_x0000_i1200" style="width:0;height:1.5pt" o:hralign="center" o:hrstd="t" o:hr="t"/>
         </w:pict>
       </w:r>
     </w:p>
@@ -16884,16 +17022,16 @@
           <w:lang w:val="fr-FR"/>
         </w:rPr>
       </w:pPr>
-      <w:bookmarkStart w:id="76" w:name="risques-et-mesures-correctives"/>
-      <w:bookmarkStart w:id="77" w:name="_Toc235547863"/>
-      <w:bookmarkEnd w:id="74"/>
+      <w:bookmarkStart w:id="76" w:name="_Toc235547863"/>
+      <w:bookmarkStart w:id="77" w:name="risques-et-mesures-correctives"/>
+      <w:bookmarkEnd w:id="75"/>
       <w:r>
         <w:rPr>
           <w:lang w:val="fr-FR"/>
         </w:rPr>
         <w:t>11. Risques et mesures correctives</w:t>
       </w:r>
-      <w:bookmarkEnd w:id="77"/>
+      <w:bookmarkEnd w:id="76"/>
     </w:p>
     <w:tbl>
       <w:tblPr>
@@ -17067,6 +17205,7 @@
               <w:rPr>
                 <w:lang w:val="fr-FR"/>
               </w:rPr>
+              <w:lastRenderedPageBreak/>
               <w:t>Coût IA non maîtrisé</w:t>
             </w:r>
           </w:p>
@@ -17154,7 +17293,6 @@
               <w:rPr>
                 <w:lang w:val="fr-FR"/>
               </w:rPr>
-              <w:lastRenderedPageBreak/>
               <w:t>Saisonnalité des expositions</w:t>
             </w:r>
           </w:p>
@@ -17342,7 +17480,7 @@
           <w:lang w:val="fr-FR"/>
         </w:rPr>
         <w:pict w14:anchorId="5D9FAF45">
-          <v:rect id="_x0000_i1668" style="width:0;height:1.5pt" o:hralign="center" o:hrstd="t" o:hr="t"/>
+          <v:rect id="_x0000_i1201" style="width:0;height:1.5pt" o:hralign="center" o:hrstd="t" o:hr="t"/>
         </w:pict>
       </w:r>
     </w:p>
@@ -17353,9 +17491,9 @@
           <w:lang w:val="fr-FR"/>
         </w:rPr>
       </w:pPr>
-      <w:bookmarkStart w:id="78" w:name="annexe-a-méthodologie-de-calcul"/>
-      <w:bookmarkStart w:id="79" w:name="_Toc235547864"/>
-      <w:bookmarkEnd w:id="76"/>
+      <w:bookmarkStart w:id="78" w:name="_Toc235547864"/>
+      <w:bookmarkStart w:id="79" w:name="annexe-a-méthodologie-de-calcul"/>
+      <w:bookmarkEnd w:id="77"/>
       <w:r>
         <w:rPr>
           <w:lang w:val="fr-FR"/>
@@ -17368,7 +17506,7 @@
         </w:rPr>
         <w:t xml:space="preserve"> du prévisionnel 36 mois</w:t>
       </w:r>
-      <w:bookmarkEnd w:id="79"/>
+      <w:bookmarkEnd w:id="78"/>
     </w:p>
     <w:p>
       <w:pPr>
@@ -17468,12 +17606,13 @@
           <w:lang w:val="fr-FR"/>
         </w:rPr>
       </w:pPr>
-      <w:bookmarkStart w:id="80" w:name="X504a31ea9130440f639cc4461f30370c86305c4"/>
-      <w:bookmarkStart w:id="81" w:name="_Toc235547865"/>
-      <w:r>
-        <w:rPr>
-          <w:lang w:val="fr-FR"/>
-        </w:rPr>
+      <w:bookmarkStart w:id="80" w:name="_Toc235547865"/>
+      <w:bookmarkStart w:id="81" w:name="X504a31ea9130440f639cc4461f30370c86305c4"/>
+      <w:r>
+        <w:rPr>
+          <w:lang w:val="fr-FR"/>
+        </w:rPr>
+        <w:lastRenderedPageBreak/>
         <w:t>Point 1 — Montée progressive linéaire (</w:t>
       </w:r>
       <w:proofErr w:type="spellStart"/>
@@ -17498,7 +17637,7 @@
         </w:rPr>
         <w:t>)</w:t>
       </w:r>
-      <w:bookmarkEnd w:id="81"/>
+      <w:bookmarkEnd w:id="80"/>
     </w:p>
     <w:p>
       <w:pPr>
@@ -17545,7 +17684,6 @@
           <w:bCs/>
           <w:lang w:val="fr-FR"/>
         </w:rPr>
-        <w:lastRenderedPageBreak/>
         <w:t>Ajustement en fin d’année</w:t>
       </w:r>
       <w:r>
@@ -17656,9 +17794,9 @@
           <w:lang w:val="fr-FR"/>
         </w:rPr>
       </w:pPr>
-      <w:bookmarkStart w:id="82" w:name="point-2-attrition-clientèle-churn"/>
-      <w:bookmarkStart w:id="83" w:name="_Toc235547866"/>
-      <w:bookmarkEnd w:id="80"/>
+      <w:bookmarkStart w:id="82" w:name="_Toc235547866"/>
+      <w:bookmarkStart w:id="83" w:name="point-2-attrition-clientèle-churn"/>
+      <w:bookmarkEnd w:id="81"/>
       <w:r>
         <w:rPr>
           <w:lang w:val="fr-FR"/>
@@ -17680,7 +17818,7 @@
         </w:rPr>
         <w:t>)</w:t>
       </w:r>
-      <w:bookmarkEnd w:id="83"/>
+      <w:bookmarkEnd w:id="82"/>
     </w:p>
     <w:p>
       <w:pPr>
@@ -17940,7 +18078,7 @@
         </w:rPr>
       </w:pPr>
       <w:bookmarkStart w:id="84" w:name="point-3-facturation-annuelle"/>
-      <w:bookmarkEnd w:id="82"/>
+      <w:bookmarkEnd w:id="83"/>
     </w:p>
     <w:p>
       <w:pPr>
@@ -18321,8 +18459,8 @@
           <w:lang w:val="fr-FR"/>
         </w:rPr>
       </w:pPr>
-      <w:bookmarkStart w:id="86" w:name="Xa4f33dfd6172bf344be39d744d9f4ccefa276d8"/>
-      <w:bookmarkStart w:id="87" w:name="_Toc235547868"/>
+      <w:bookmarkStart w:id="86" w:name="_Toc235547868"/>
+      <w:bookmarkStart w:id="87" w:name="Xa4f33dfd6172bf344be39d744d9f4ccefa276d8"/>
       <w:bookmarkEnd w:id="84"/>
       <w:r>
         <w:rPr>
@@ -18330,7 +18468,7 @@
         </w:rPr>
         <w:t>Point 4 — Contrats Zénith (grands événements)</w:t>
       </w:r>
-      <w:bookmarkEnd w:id="87"/>
+      <w:bookmarkEnd w:id="86"/>
     </w:p>
     <w:p>
       <w:pPr>
@@ -18663,7 +18801,7 @@
         </w:rPr>
       </w:pPr>
       <w:bookmarkStart w:id="88" w:name="point-5-tva"/>
-      <w:bookmarkEnd w:id="86"/>
+      <w:bookmarkEnd w:id="87"/>
     </w:p>
     <w:p>
       <w:pPr>
@@ -18677,6 +18815,7 @@
         <w:rPr>
           <w:lang w:val="fr-FR"/>
         </w:rPr>
+        <w:lastRenderedPageBreak/>
         <w:t>Point 5 — TVA</w:t>
       </w:r>
       <w:bookmarkEnd w:id="89"/>
@@ -18778,7 +18917,6 @@
           <w:bCs/>
           <w:lang w:val="fr-FR"/>
         </w:rPr>
-        <w:lastRenderedPageBreak/>
         <w:t>Trésorerie</w:t>
       </w:r>
       <w:r>
@@ -19590,7 +19728,7 @@
       </w:pPr>
       <w:bookmarkStart w:id="92" w:name="annexe-c-glossaire"/>
       <w:bookmarkEnd w:id="1"/>
-      <w:bookmarkEnd w:id="78"/>
+      <w:bookmarkEnd w:id="79"/>
       <w:r>
         <w:rPr>
           <w:lang w:val="fr-FR"/>
@@ -26417,6 +26555,7 @@
   <w:style w:type="character" w:default="1" w:styleId="Policepardfaut">
     <w:name w:val="Default Paragraph Font"/>
     <w:uiPriority w:val="1"/>
+    <w:semiHidden/>
     <w:unhideWhenUsed/>
   </w:style>
   <w:style w:type="table" w:default="1" w:styleId="TableauNormal">

</xml_diff>